<commit_message>
refactor: archive pre-AI-pivot content, clean repo to Applied AI focus
Move 10 non-AI applications (simulation, HPC, defense, cloud/Java) to
archive/pre-ai-pivot-2026-06/. Archive simulation resumes, cover letter
templates, all pre-pivot search outputs (23 files), and stale misc docs.

Delete: SpaceX placeholder file, expired Gmail OAuth token.

One application kept: 2026-04_intrinsic (Google robotics AI, reference).
Repo now contains only Applied AI Systems Engineer positioning.

Co-Authored-By: Claude Sonnet 4.6 <noreply@anthropic.com>
</commit_message>
<xml_diff>
--- a/resumes/resume_applied_ai_systems.docx
+++ b/resumes/resume_applied_ai_systems.docx
@@ -13,7 +13,24 @@
       </w:r>
       <w:r>
         <w:br/>
-        <w:t>306.361.7692 | </w:t>
+      </w:r>
+      <w:r>
+        <w:t>248</w:t>
+      </w:r>
+      <w:r>
+        <w:t>.</w:t>
+      </w:r>
+      <w:r>
+        <w:t>989</w:t>
+      </w:r>
+      <w:r>
+        <w:t>.</w:t>
+      </w:r>
+      <w:r>
+        <w:t>4160</w:t>
+      </w:r>
+      <w:r>
+        <w:t xml:space="preserve"> | </w:t>
       </w:r>
       <w:hyperlink r:id="rId5" w:history="1">
         <w:r>
@@ -325,7 +342,13 @@
         </w:numPr>
       </w:pPr>
       <w:r>
-        <w:t>Delivered high-risk feature enhancements within the first 90 days, accelerating expansion of core system capabilities.</w:t>
+        <w:t xml:space="preserve">Delivered high-risk feature enhancements within the first </w:t>
+      </w:r>
+      <w:r>
+        <w:t>180</w:t>
+      </w:r>
+      <w:r>
+        <w:t xml:space="preserve"> days, accelerating expansion of core system capabilities.</w:t>
       </w:r>
     </w:p>
     <w:p>

</xml_diff>

<commit_message>
Add demonstrated tooling to applied AI resume
</commit_message>
<xml_diff>
--- a/resumes/resume_applied_ai_systems.docx
+++ b/resumes/resume_applied_ai_systems.docx
@@ -92,6 +92,16 @@
       </w:r>
       <w:r>
         <w:t>, Codex, Copilot and Claude Code usage.</w:t>
+      </w:r>
+    </w:p>
+    <w:p>
+      <w:r>
+        <w:t>AI and document tooling: Python, Docling, OpenAI API, Anthropic API, OpenAI embeddings (text-embedding-3-small, text-embedding-3-large), Kuzu, exact/BM25 retrieval, graph-expanded retrieval</w:t>
+      </w:r>
+    </w:p>
+    <w:p>
+      <w:r>
+        <w:t>Systems and portfolio tooling: C++23, CMake, Direct3D 12, HLSL, Dear ImGui, Catch2, xUnit, SQLite, webhook delivery and retry workflows</w:t>
       </w:r>
     </w:p>
     <w:p>

</xml_diff>